<commit_message>
Resume: clearer download button labels and saved filenames (URLs unchanged)
</commit_message>
<xml_diff>
--- a/resumes/src/Arjun-Thakur-Resume-2Page.docx
+++ b/resumes/src/Arjun-Thakur-Resume-2Page.docx
@@ -36,7 +36,7 @@
           <w:sz w:val="20"/>
           <w:szCs w:val="20"/>
         </w:rPr>
-        <w:t xml:space="preserve">Available for: Lead / Principal AI Engineer | Architect | Fractional CTO  |  AI training, workshops &amp; speaking  |  Full-time &amp; freelance  |  Remote (global)  |  Based in Indore, India</w:t>
+        <w:t xml:space="preserve">Available for: Lead / Principal AI Engineer | Architect | Fractional CTO  |  AI training, workshops &amp; speaking  |  Full-time &amp; freelance  |  Remote (global)  |  Based in India · open to international relocation</w:t>
       </w:r>
     </w:p>
     <w:p>
@@ -639,7 +639,7 @@
           <w:szCs w:val="20"/>
         </w:rPr>
         <w:tab/>
-        <w:t>Nov 2024 -- Apr 2025 | Bengaluru / Indore</w:t>
+        <w:t>Nov 2024 -- Apr 2025 | Bengaluru</w:t>
       </w:r>
     </w:p>
     <w:p>

</xml_diff>